<commit_message>
Update MVP scaffold, docs, and frontend/backend slices
</commit_message>
<xml_diff>
--- a/docs/exports/project-status-roadmap.docx
+++ b/docs/exports/project-status-roadmap.docx
@@ -330,6 +330,22 @@
         <w:pStyle w:val="ListParagraph"/>
       </w:pPr>
       <w:r>
+        <w:t xml:space="preserve">- Marketplace connector factory for all non-social registry sources (37 portals/classifieds/agencies/OTAs/registers): shared `HtmlPortalConnector`, legal-rule derivation, optional `sync-database` CLI to upsert `source_registry` planning fields, `source_legal_rule`, and `source_endpoint` rows.</w:t>
+      </w:r>
+    </w:p>
+    <w:p>
+      <w:pPr>
+        <w:pStyle w:val="ListParagraph"/>
+      </w:pPr>
+      <w:r>
+        <w:t xml:space="preserve">- Alembic revision `20260408_0002` plus `sql/schema.sql` updates for `primary_url`, `related_urls`, `languages`, and `listing_types` on `source_registry`.</w:t>
+      </w:r>
+    </w:p>
+    <w:p>
+      <w:pPr>
+        <w:pStyle w:val="ListParagraph"/>
+      </w:pPr>
+      <w:r>
         <w:t xml:space="preserve">- Unit tests for current scaffold.</w:t>
       </w:r>
     </w:p>
@@ -356,7 +372,7 @@
         <w:pStyle w:val="ListParagraph"/>
       </w:pPr>
       <w:r>
-        <w:t xml:space="preserve">- No real tier-1 live connector for `Homes.bg`, `OLX.bg`, `alo.bg`, `imot.bg`, or other portals.</w:t>
+        <w:t xml:space="preserve">- No real tier-1 live connector for `OLX.bg`, `alo.bg`, `imot.bg`, or other portals beyond the shared HTML scaffold (Homes.bg remains the only fixture-tuned parser).</w:t>
       </w:r>
     </w:p>
     <w:p>
@@ -452,7 +468,7 @@
         <w:pStyle w:val="ListParagraph"/>
       </w:pPr>
       <w:r>
-        <w:t xml:space="preserve">- Source registry persistence is still lossy: the DB schema/repository layer does not yet store all registry planning fields such as `primary_url`, `related_urls`, `languages`, and `listing_types`.</w:t>
+        <w:t xml:space="preserve">- Source registry persistence now stores `primary_url`, `related_urls`, `languages`, and `listing_types` when `sync-database` is run against PostgreSQL.</w:t>
       </w:r>
     </w:p>
     <w:p>

</xml_diff>

<commit_message>
Expand control plane, tier-1 fixtures, and operator reporting.
Add agent task/journey workflow, admin source stats + XLSX export, optional golden-path validation, and broaden fixture-backed parsing coverage.

Made-with: Cursor
</commit_message>
<xml_diff>
--- a/docs/exports/project-status-roadmap.docx
+++ b/docs/exports/project-status-roadmap.docx
@@ -234,7 +234,7 @@
         <w:pStyle w:val="ListParagraph"/>
       </w:pPr>
       <w:r>
-        <w:t xml:space="preserve">- Frontend dependency metadata in `package.json`.</w:t>
+        <w:t xml:space="preserve">- Frontend dependency metadata in `package.json` plus a runnable Next.js App Router shell (Tailwind, TanStack Query, home + MVP routes) that reads the Python dev API (`/health`, `/sources`) when `make run-api` is up.</w:t>
       </w:r>
     </w:p>
     <w:p>
@@ -444,15 +444,15 @@
         <w:pStyle w:val="ListParagraph"/>
       </w:pPr>
       <w:r>
-        <w:t xml:space="preserve">- No Next.js frontend yet.</w:t>
-      </w:r>
-    </w:p>
-    <w:p>
-      <w:pPr>
-        <w:pStyle w:val="ListParagraph"/>
-      </w:pPr>
-      <w:r>
-        <w:t xml:space="preserve">- The current `run-api`, `run-worker`, `run-scheduler`, and `run-frontend` targets are development placeholders, not production services.</w:t>
+        <w:t xml:space="preserve">- Next.js App Router UI shell exists at the repo root (`app/`, `npm run dev`); listings feed and map/chat/settings/admin are placeholders until FastAPI and CRM/map APIs land.</w:t>
+      </w:r>
+    </w:p>
+    <w:p>
+      <w:pPr>
+        <w:pStyle w:val="ListParagraph"/>
+      </w:pPr>
+      <w:r>
+        <w:t xml:space="preserve">- The current `run-api`, `run-worker`, `run-scheduler`, and `run-frontend` targets are development placeholders, not production services (`run-frontend` now starts Next.js when Node/npm is available).</w:t>
       </w:r>
     </w:p>
     <w:p>
@@ -492,7 +492,7 @@
         <w:pStyle w:val="ListParagraph"/>
       </w:pPr>
       <w:r>
-        <w:t xml:space="preserve">- No `/listings`, `/properties/[id]`, `/map`, `/chat`, `/settings`, or `/admin` pages yet.</w:t>
+        <w:t xml:space="preserve">- `/listings`, `/properties/[id]`, `/map`, `/chat`, `/settings`, and `/admin` routes exist as designed shells; canonical listing search, map layers, and CRM are not wired to real APIs yet.</w:t>
       </w:r>
     </w:p>
     <w:p>
@@ -1506,18 +1506,18 @@
     </w:p>
     <w:p>
       <w:pPr>
-        <w:pStyle w:val="ChecklistTodo"/>
-      </w:pPr>
-      <w:r>
-        <w:t xml:space="preserve">TODO - 97. Create Next.js frontend app under `web/`.</w:t>
-      </w:r>
-    </w:p>
-    <w:p>
-      <w:pPr>
-        <w:pStyle w:val="ChecklistTodo"/>
-      </w:pPr>
-      <w:r>
-        <w:t xml:space="preserve">TODO - 98. Implement shared typed API client.</w:t>
+        <w:pStyle w:val="ChecklistDone"/>
+      </w:pPr>
+      <w:r>
+        <w:t xml:space="preserve">DONE - 97. Create Next.js frontend app (App Router at repo root next to `package.json`; static `web/index.html` remains a fallback via `make run-frontend-static`).</w:t>
+      </w:r>
+    </w:p>
+    <w:p>
+      <w:pPr>
+        <w:pStyle w:val="ListParagraph"/>
+      </w:pPr>
+      <w:r>
+        <w:t xml:space="preserve">- [~] 98. Implement shared typed API client (server fetch helpers, `/api/backend/*` proxy, TanStack Query for live health pill; expand when FastAPI is live).</w:t>
       </w:r>
     </w:p>
     <w:p>

</xml_diff>

<commit_message>
Publish current working project state
</commit_message>
<xml_diff>
--- a/docs/exports/project-status-roadmap.docx
+++ b/docs/exports/project-status-roadmap.docx
@@ -12,7 +12,7 @@
     </w:p>
     <w:p>
       <w:r>
-        <w:t>Updated: 2026-04-08</w:t>
+        <w:t>Updated: 2026-04-09</w:t>
       </w:r>
     </w:p>
     <w:p>
@@ -25,7 +25,50 @@
     </w:p>
     <w:p>
       <w:r>
-        <w:t>The project is at **Stage 2: Database And Persistence - In Progress**.</w:t>
+        <w:t>The project is at **Stage 3: Live tier-1/2 ingestion + volume gate — primary focus**.</w:t>
+      </w:r>
+    </w:p>
+    <w:p>
+      <w:r>
+        <w:t>**Previous:** Stage 2 (database and persistence) remains in motion with many backend slices implemented or awaiting verification.</w:t>
+      </w:r>
+    </w:p>
+    <w:p>
+      <w:r>
+        <w:t>**Now:** Execution is **sequenced** per `docs/agents/TASKS.md` § “Immediate execution priorities (2026-04-09)”:</w:t>
+      </w:r>
+    </w:p>
+    <w:p>
+      <w:r>
+        <w:t>1. **`scraper_1`**: `S1-15` → **`S1-18`** (non-stop until **≥100 listings × ≥5** tier-1/2 sources in **`canonical_listing`**; report in `docs/exports/tier12-live-volume-report.md`).</w:t>
+      </w:r>
+    </w:p>
+    <w:p>
+      <w:r>
+        <w:t>2. **`backend_developer`**: **`BD-11`** first so live rows are countable in Postgres; **`BD-12`+** after `S1-18`.</w:t>
+      </w:r>
+    </w:p>
+    <w:p>
+      <w:r>
+        <w:t>3. **`debugger`**: **`DBG-06`** / **`DBG-05`** after live volume + ingest proof unless waived.</w:t>
+      </w:r>
+    </w:p>
+    <w:p>
+      <w:r>
+        <w:t>**Fixture analysis:** `docs/exports/stage1-product-type-coverage.md` — all required product types covered by tier-1/2 fixtures (parser readiness, not production volume).</w:t>
+      </w:r>
+    </w:p>
+    <w:p>
+      <w:pPr>
+        <w:pStyle w:val="Heading1"/>
+      </w:pPr>
+      <w:r>
+        <w:t>Prior Stage Note (Stage 2)</w:t>
+      </w:r>
+    </w:p>
+    <w:p>
+      <w:r>
+        <w:t>The project was at **Stage 2: Database And Persistence - In Progress**.</w:t>
       </w:r>
     </w:p>
     <w:p>

</xml_diff>